<commit_message>
docs: model1-panduan versi Bahasa Indonesia + selaras paket dataset bebas (E4)
</commit_message>
<xml_diff>
--- a/Pembagian Tugas/model1-panduan.docx
+++ b/Pembagian Tugas/model1-panduan.docx
@@ -2,7 +2,7 @@
 <file path=word/document.xml><?xml version="1.0" encoding="utf-8"?>
 <w:document xmlns:w="http://schemas.openxmlformats.org/wordprocessingml/2006/main" xmlns:m="http://schemas.openxmlformats.org/officeDocument/2006/math" xmlns:r="http://schemas.openxmlformats.org/officeDocument/2006/relationships" xmlns:o="urn:schemas-microsoft-com:office:office" xmlns:v="urn:schemas-microsoft-com:vml" xmlns:w10="urn:schemas-microsoft-com:office:word" xmlns:a="http://schemas.openxmlformats.org/drawingml/2006/main" xmlns:pic="http://schemas.openxmlformats.org/drawingml/2006/picture" xmlns:wp="http://schemas.openxmlformats.org/drawingml/2006/wordprocessingDrawing">
   <w:body>
-    <w:bookmarkStart w:id="35" w:name="model-1--klasifikasi-jenis-pakaian-ml"/>
+    <w:bookmarkStart w:id="32" w:name="model-1--klasifikasi-jenis-pakaian-ml"/>
     <w:p>
       <w:pPr>
         <w:pStyle w:val="Heading1"/>
@@ -29,13 +29,7 @@
         <w:t xml:space="preserve">E4.1–E4.6</w:t>
       </w:r>
       <w:r>
-        <w:t xml:space="preserve">: menyiapkan dataset, menggabungkan 3 dataset</w:t>
-      </w:r>
-      <w:r>
-        <w:t xml:space="preserve"> </w:t>
-      </w:r>
-      <w:r>
-        <w:t xml:space="preserve">menjadi satu, melatih</w:t>
+        <w:t xml:space="preserve">: menyiapkan dataset, menggabungkan</w:t>
       </w:r>
       <w:r>
         <w:t xml:space="preserve"> </w:t>
@@ -45,28 +39,58 @@
           <w:bCs/>
           <w:b/>
         </w:rPr>
-        <w:t xml:space="preserve">YOLOv11n-cls</w:t>
-      </w:r>
-      <w:r>
-        <w:t xml:space="preserve"> </w:t>
-      </w:r>
-      <w:r>
-        <w:t xml:space="preserve">(+ baseline MobileNetV2), mengevaluasi,</w:t>
-      </w:r>
-      <w:r>
-        <w:t xml:space="preserve"> </w:t>
-      </w:r>
-      <w:r>
-        <w:t xml:space="preserve">dan mengekspor ke</w:t>
-      </w:r>
-      <w:r>
-        <w:t xml:space="preserve"> </w:t>
+        <w:t xml:space="preserve">3 dataset</w:t>
       </w:r>
       <w:r>
         <w:rPr>
           <w:bCs/>
           <w:b/>
         </w:rPr>
+        <w:t xml:space="preserve"> </w:t>
+      </w:r>
+      <w:r>
+        <w:rPr>
+          <w:bCs/>
+          <w:b/>
+        </w:rPr>
+        <w:t xml:space="preserve">berlisensi bebas</w:t>
+      </w:r>
+      <w:r>
+        <w:t xml:space="preserve"> </w:t>
+      </w:r>
+      <w:r>
+        <w:t xml:space="preserve">menjadi satu, melatih</w:t>
+      </w:r>
+      <w:r>
+        <w:t xml:space="preserve"> </w:t>
+      </w:r>
+      <w:r>
+        <w:rPr>
+          <w:bCs/>
+          <w:b/>
+        </w:rPr>
+        <w:t xml:space="preserve">YOLOv11n-cls</w:t>
+      </w:r>
+      <w:r>
+        <w:t xml:space="preserve"> </w:t>
+      </w:r>
+      <w:r>
+        <w:t xml:space="preserve">(+ baseline</w:t>
+      </w:r>
+      <w:r>
+        <w:t xml:space="preserve"> </w:t>
+      </w:r>
+      <w:r>
+        <w:t xml:space="preserve">MobileNetV2), mengevaluasi, dan mengekspor ke</w:t>
+      </w:r>
+      <w:r>
+        <w:t xml:space="preserve"> </w:t>
+      </w:r>
+      <w:r>
+        <w:rPr>
+          <w:bCs/>
+          <w:b/>
+        </w:rPr>
         <w:t xml:space="preserve">TFLite int8</w:t>
       </w:r>
       <w:r>
@@ -81,29 +105,39 @@
         <w:pStyle w:val="BlockText"/>
       </w:pPr>
       <w:r>
-        <w:t xml:space="preserve">Semua dataset di pipeline ini</w:t>
-      </w:r>
-      <w:r>
-        <w:t xml:space="preserve"> </w:t>
-      </w:r>
-      <w:r>
         <w:rPr>
           <w:bCs/>
           <w:b/>
         </w:rPr>
-        <w:t xml:space="preserve">lisensi bersih</w:t>
-      </w:r>
-      <w:r>
-        <w:t xml:space="preserve"> </w:t>
-      </w:r>
-      <w:r>
-        <w:t xml:space="preserve">(CC0/MIT): aman untuk</w:t>
-      </w:r>
-      <w:r>
-        <w:t xml:space="preserve"> </w:t>
-      </w:r>
-      <w:r>
-        <w:t xml:space="preserve">akademik maupun komersial. Lihat</w:t>
+        <w:t xml:space="preserve">Lisensi dataset:</w:t>
+      </w:r>
+      <w:r>
+        <w:t xml:space="preserve"> </w:t>
+      </w:r>
+      <w:r>
+        <w:t xml:space="preserve">seluruh dataset di pipeline ini berlisensi</w:t>
+      </w:r>
+      <w:r>
+        <w:t xml:space="preserve"> </w:t>
+      </w:r>
+      <w:r>
+        <w:rPr>
+          <w:bCs/>
+          <w:b/>
+        </w:rPr>
+        <w:t xml:space="preserve">bebas</w:t>
+      </w:r>
+      <w:r>
+        <w:t xml:space="preserve"> </w:t>
+      </w:r>
+      <w:r>
+        <w:t xml:space="preserve">(CC0/MIT) — aman untuk keperluan akademik maupun komersial. Ini sesuai</w:t>
+      </w:r>
+      <w:r>
+        <w:t xml:space="preserve"> </w:t>
+      </w:r>
+      <w:r>
+        <w:t xml:space="preserve">"paket bersih" di</w:t>
       </w:r>
       <w:r>
         <w:t xml:space="preserve"> </w:t>
@@ -118,14 +152,35 @@
         <w:t xml:space="preserve"> </w:t>
       </w:r>
       <w:r>
-        <w:t xml:space="preserve">§5.</w:t>
-      </w:r>
-    </w:p>
-    <w:p>
-      <w:r>
-        <w:pict>
-          <v:rect style="width:0;height:1.5pt" o:hralign="center" o:hrstd="t" o:hr="t"/>
-        </w:pict>
+        <w:t xml:space="preserve">§5: hanya dataset ber-status</w:t>
+      </w:r>
+      <w:r>
+        <w:t xml:space="preserve"> </w:t>
+      </w:r>
+      <w:r>
+        <w:t xml:space="preserve">✅ yang dipakai. Dataset non-komersial atau berlisensi tidak jelas (mis.</w:t>
+      </w:r>
+      <w:r>
+        <w:t xml:space="preserve"> </w:t>
+      </w:r>
+      <w:r>
+        <w:t xml:space="preserve">DeepFashion/DeepFashion2, Digikala, FashionStylist, Fashion &amp; Color)</w:t>
+      </w:r>
+      <w:r>
+        <w:t xml:space="preserve"> </w:t>
+      </w:r>
+      <w:r>
+        <w:rPr>
+          <w:bCs/>
+          <w:b/>
+        </w:rPr>
+        <w:t xml:space="preserve">tidak dipakai</w:t>
+      </w:r>
+      <w:r>
+        <w:t xml:space="preserve"> </w:t>
+      </w:r>
+      <w:r>
+        <w:t xml:space="preserve">di pipeline ini.</w:t>
       </w:r>
     </w:p>
     <w:bookmarkStart w:id="20" w:name="Xeb2e0d2063d52b300e8fe71b88d5a5b2eaa3d31"/>
@@ -145,7 +200,7 @@
         <w:rPr>
           <w:rStyle w:val="CommentTok"/>
         </w:rPr>
-        <w:t xml:space="preserve"># 1. Virtual environment Python (sekali saja)</w:t>
+        <w:t xml:space="preserve"># 1. Lingkungan virtual Python (sekali saja)</w:t>
       </w:r>
       <w:r>
         <w:br/>
@@ -247,7 +302,7 @@
         <w:rPr>
           <w:rStyle w:val="CommentTok"/>
         </w:rPr>
-        <w:t xml:space="preserve"># 2. Library</w:t>
+        <w:t xml:space="preserve"># 2. Pustaka</w:t>
       </w:r>
       <w:r>
         <w:br/>
@@ -280,7 +335,7 @@
         <w:rPr>
           <w:rStyle w:val="CommentTok"/>
         </w:rPr>
-        <w:t xml:space="preserve"># 3. Kaggle API key: taruh kaggle.json di %USERPROFILE%\.kaggle\ (sekali saja)</w:t>
+        <w:t xml:space="preserve"># 3. Kunci API Kaggle: taruh kaggle.json di %USERPROFILE%\.kaggle\ (sekali saja)</w:t>
       </w:r>
       <w:r>
         <w:br/>
@@ -345,7 +400,7 @@
         <w:pStyle w:val="FirstParagraph"/>
       </w:pPr>
       <w:r>
-        <w:t xml:space="preserve">Training di laptop tanpa GPU bisa lambat — boleh pakai</w:t>
+        <w:t xml:space="preserve">Pelatihan di laptop tanpa GPU bisa lambat — boleh memakai</w:t>
       </w:r>
       <w:r>
         <w:t xml:space="preserve"> </w:t>
@@ -355,16 +410,24 @@
           <w:bCs/>
           <w:b/>
         </w:rPr>
-        <w:t xml:space="preserve">Colab (GPU T4 gratis)</w:t>
-      </w:r>
-      <w:r>
-        <w:t xml:space="preserve">:</w:t>
-      </w:r>
-      <w:r>
-        <w:t xml:space="preserve"> </w:t>
-      </w:r>
-      <w:r>
-        <w:t xml:space="preserve">unggah folder</w:t>
+        <w:t xml:space="preserve">Colab (GPU T4</w:t>
+      </w:r>
+      <w:r>
+        <w:rPr>
+          <w:bCs/>
+          <w:b/>
+        </w:rPr>
+        <w:t xml:space="preserve"> </w:t>
+      </w:r>
+      <w:r>
+        <w:rPr>
+          <w:bCs/>
+          <w:b/>
+        </w:rPr>
+        <w:t xml:space="preserve">gratis)</w:t>
+      </w:r>
+      <w:r>
+        <w:t xml:space="preserve">: unggah folder</w:t>
       </w:r>
       <w:r>
         <w:t xml:space="preserve"> </w:t>
@@ -379,14 +442,13 @@
         <w:t xml:space="preserve"> </w:t>
       </w:r>
       <w:r>
-        <w:t xml:space="preserve">+ dataset ke Google Drive, jalankan script yang sama.</w:t>
-      </w:r>
-    </w:p>
-    <w:p>
-      <w:r>
-        <w:pict>
-          <v:rect style="width:0;height:1.5pt" o:hralign="center" o:hrstd="t" o:hr="t"/>
-        </w:pict>
+        <w:t xml:space="preserve">+ dataset ke Google Drive, lalu jalankan script</w:t>
+      </w:r>
+      <w:r>
+        <w:t xml:space="preserve"> </w:t>
+      </w:r>
+      <w:r>
+        <w:t xml:space="preserve">yang sama.</w:t>
       </w:r>
     </w:p>
     <w:bookmarkEnd w:id="20"/>
@@ -551,7 +613,7 @@
         <w:rPr>
           <w:rStyle w:val="VerbatimChar"/>
         </w:rPr>
-        <w:t xml:space="preserve">├─ runs/                      # (di-gitignore) checkpoint &amp; log training</w:t>
+        <w:t xml:space="preserve">├─ runs/                      # (di-gitignore) checkpoint &amp; log pelatihan</w:t>
       </w:r>
       <w:r>
         <w:br/>
@@ -561,13 +623,6 @@
           <w:rStyle w:val="VerbatimChar"/>
         </w:rPr>
         <w:t xml:space="preserve">└─ reports/                   # hasil evaluasi (di-commit untuk laporan E4.5)</w:t>
-      </w:r>
-    </w:p>
-    <w:p>
-      <w:r>
-        <w:pict>
-          <v:rect style="width:0;height:1.5pt" o:hralign="center" o:hrstd="t" o:hr="t"/>
-        </w:pict>
       </w:r>
     </w:p>
     <w:bookmarkEnd w:id="21"/>
@@ -582,6 +637,42 @@
     </w:p>
     <w:p>
       <w:pPr>
+        <w:pStyle w:val="FirstParagraph"/>
+      </w:pPr>
+      <w:r>
+        <w:t xml:space="preserve">Unduh</w:t>
+      </w:r>
+      <w:r>
+        <w:t xml:space="preserve"> </w:t>
+      </w:r>
+      <w:r>
+        <w:rPr>
+          <w:bCs/>
+          <w:b/>
+        </w:rPr>
+        <w:t xml:space="preserve">3 dataset berlisensi bebas</w:t>
+      </w:r>
+      <w:r>
+        <w:t xml:space="preserve"> </w:t>
+      </w:r>
+      <w:r>
+        <w:t xml:space="preserve">ke</w:t>
+      </w:r>
+      <w:r>
+        <w:t xml:space="preserve"> </w:t>
+      </w:r>
+      <w:r>
+        <w:rPr>
+          <w:rStyle w:val="VerbatimChar"/>
+        </w:rPr>
+        <w:t xml:space="preserve">ml/data/raw/</w:t>
+      </w:r>
+      <w:r>
+        <w:t xml:space="preserve">:</w:t>
+      </w:r>
+    </w:p>
+    <w:p>
+      <w:pPr>
         <w:pStyle w:val="SourceCode"/>
       </w:pPr>
       <w:r>
@@ -636,7 +727,7 @@
         <w:rPr>
           <w:rStyle w:val="NormalTok"/>
         </w:rPr>
-        <w:t xml:space="preserve">full           </w:t>
+        <w:t xml:space="preserve">full            </w:t>
       </w:r>
       <w:r>
         <w:rPr>
@@ -696,7 +787,7 @@
         <w:rPr>
           <w:rStyle w:val="NormalTok"/>
         </w:rPr>
-        <w:t xml:space="preserve">full    </w:t>
+        <w:t xml:space="preserve">full      </w:t>
       </w:r>
       <w:r>
         <w:rPr>
@@ -942,7 +1033,7 @@
         <w:rPr>
           <w:rStyle w:val="NormalTok"/>
         </w:rPr>
-        <w:t xml:space="preserve">carousell        </w:t>
+        <w:t xml:space="preserve">carousell         </w:t>
       </w:r>
       <w:r>
         <w:rPr>
@@ -1009,6 +1100,17 @@
             </w:r>
           </w:p>
         </w:tc>
+        <w:tc>
+          <w:p>
+            <w:pPr>
+              <w:pStyle w:val="Compact"/>
+              <w:jc w:val="left"/>
+            </w:pPr>
+            <w:r>
+              <w:t xml:space="preserve">Peran</w:t>
+            </w:r>
+          </w:p>
+        </w:tc>
       </w:tr>
       <w:tr>
         <w:tc>
@@ -1090,7 +1192,18 @@
               <w:jc w:val="left"/>
             </w:pPr>
             <w:r>
-              <w:t xml:space="preserve">CC0</w:t>
+              <w:t xml:space="preserve">✅ CC0</w:t>
+            </w:r>
+          </w:p>
+        </w:tc>
+        <w:tc>
+          <w:p>
+            <w:pPr>
+              <w:pStyle w:val="Compact"/>
+              <w:jc w:val="left"/>
+            </w:pPr>
+            <w:r>
+              <w:t xml:space="preserve">Latih + uji utama Model 1</w:t>
             </w:r>
           </w:p>
         </w:tc>
@@ -1175,7 +1288,33 @@
               <w:jc w:val="left"/>
             </w:pPr>
             <w:r>
-              <w:t xml:space="preserve">MIT</w:t>
+              <w:t xml:space="preserve">✅ MIT</w:t>
+            </w:r>
+          </w:p>
+        </w:tc>
+        <w:tc>
+          <w:p>
+            <w:pPr>
+              <w:pStyle w:val="Compact"/>
+              <w:jc w:val="left"/>
+            </w:pPr>
+            <w:r>
+              <w:t xml:space="preserve">Tambahan latih + label warna</w:t>
+            </w:r>
+            <w:r>
+              <w:t xml:space="preserve"> </w:t>
+            </w:r>
+            <w:r>
+              <w:rPr>
+                <w:rStyle w:val="VerbatimChar"/>
+              </w:rPr>
+              <w:t xml:space="preserve">baseColour</w:t>
+            </w:r>
+            <w:r>
+              <w:t xml:space="preserve"> </w:t>
+            </w:r>
+            <w:r>
+              <w:t xml:space="preserve">(Modul 2)</w:t>
             </w:r>
           </w:p>
         </w:tc>
@@ -1221,7 +1360,18 @@
               <w:jc w:val="left"/>
             </w:pPr>
             <w:r>
-              <w:t xml:space="preserve">MIT</w:t>
+              <w:t xml:space="preserve">✅ MIT</w:t>
+            </w:r>
+          </w:p>
+        </w:tc>
+        <w:tc>
+          <w:p>
+            <w:pPr>
+              <w:pStyle w:val="Compact"/>
+              <w:jc w:val="left"/>
+            </w:pPr>
+            <w:r>
+              <w:t xml:space="preserve">Uji ketahanan (foto marketplace)</w:t>
             </w:r>
           </w:p>
         </w:tc>
@@ -1232,6 +1382,88 @@
         <w:pStyle w:val="BlockText"/>
       </w:pPr>
       <w:r>
+        <w:t xml:space="preserve">Ketiganya lolos filter "paket bersih" (hanya lisensi bebas). Rincian status</w:t>
+      </w:r>
+      <w:r>
+        <w:t xml:space="preserve"> </w:t>
+      </w:r>
+      <w:r>
+        <w:t xml:space="preserve">lisensi &amp; alternatif ada di</w:t>
+      </w:r>
+      <w:r>
+        <w:t xml:space="preserve"> </w:t>
+      </w:r>
+      <w:r>
+        <w:rPr>
+          <w:rStyle w:val="VerbatimChar"/>
+        </w:rPr>
+        <w:t xml:space="preserve">context/datasets-tambahan.md</w:t>
+      </w:r>
+      <w:r>
+        <w:t xml:space="preserve"> </w:t>
+      </w:r>
+      <w:r>
+        <w:t xml:space="preserve">§1 dan §5.</w:t>
+      </w:r>
+      <w:r>
+        <w:t xml:space="preserve"> </w:t>
+      </w:r>
+      <w:r>
+        <w:t xml:space="preserve">Opsional bebas: Fashion-MNIST (MIT) hanya untuk uji kewajaran pipeline;</w:t>
+      </w:r>
+      <w:r>
+        <w:t xml:space="preserve"> </w:t>
+      </w:r>
+      <w:r>
+        <w:t xml:space="preserve">Myntra Fashion Product (PDDL).</w:t>
+      </w:r>
+    </w:p>
+    <w:p>
+      <w:pPr>
+        <w:pStyle w:val="BlockText"/>
+      </w:pPr>
+      <w:r>
+        <w:t xml:space="preserve">Catatan atribusi: Fashion Product Images &amp; Carousell adalah data hasil</w:t>
+      </w:r>
+      <w:r>
+        <w:t xml:space="preserve"> </w:t>
+      </w:r>
+      <w:r>
+        <w:t xml:space="preserve">scraping — lisensi yang dideklarasikan uploader adalah MIT; hak gambar tetap</w:t>
+      </w:r>
+      <w:r>
+        <w:t xml:space="preserve"> </w:t>
+      </w:r>
+      <w:r>
+        <w:t xml:space="preserve">milik brand. Aman untuk riset akademik dengan atribusi; untuk komersial perlu</w:t>
+      </w:r>
+      <w:r>
+        <w:t xml:space="preserve"> </w:t>
+      </w:r>
+      <w:r>
+        <w:t xml:space="preserve">pertimbangan lanjut (lihat</w:t>
+      </w:r>
+      <w:r>
+        <w:t xml:space="preserve"> </w:t>
+      </w:r>
+      <w:r>
+        <w:rPr>
+          <w:rStyle w:val="VerbatimChar"/>
+        </w:rPr>
+        <w:t xml:space="preserve">context/datasets-tambahan.md</w:t>
+      </w:r>
+      <w:r>
+        <w:t xml:space="preserve"> </w:t>
+      </w:r>
+      <w:r>
+        <w:t xml:space="preserve">§1).</w:t>
+      </w:r>
+    </w:p>
+    <w:p>
+      <w:pPr>
+        <w:pStyle w:val="BlockText"/>
+      </w:pPr>
+      <w:r>
         <w:t xml:space="preserve">Biarkan</w:t>
       </w:r>
       <w:r>
@@ -1275,7 +1507,7 @@
         <w:t xml:space="preserve"> </w:t>
       </w:r>
       <w:r>
-        <w:t xml:space="preserve">script + label maps + laporan evaluasi. Foto lapangan 150 (E10.2) simpan di</w:t>
+        <w:t xml:space="preserve">script + label maps + laporan evaluasi. Foto lapangan 150 (E10.2) disimpan di</w:t>
       </w:r>
       <w:r>
         <w:t xml:space="preserve"> </w:t>
@@ -1290,14 +1522,7 @@
         <w:t xml:space="preserve"> </w:t>
       </w:r>
       <w:r>
-        <w:t xml:space="preserve">(juga di-gitignore, serahkan via Drive).</w:t>
-      </w:r>
-    </w:p>
-    <w:p>
-      <w:r>
-        <w:pict>
-          <v:rect style="width:0;height:1.5pt" o:hralign="center" o:hrstd="t" o:hr="t"/>
-        </w:pict>
+        <w:t xml:space="preserve">(juga di-gitignore, diserahkan lewat Drive).</w:t>
       </w:r>
     </w:p>
     <w:bookmarkEnd w:id="22"/>
@@ -1965,7 +2190,7 @@
           <w:bCs/>
           <w:b/>
         </w:rPr>
-        <w:t xml:space="preserve">buang</w:t>
+        <w:t xml:space="preserve">dibuang</w:t>
       </w:r>
       <w:r>
         <w:t xml:space="preserve"> </w:t>
@@ -2043,13 +2268,13 @@
         <w:t xml:space="preserve">Undershirt</w:t>
       </w:r>
       <w:r>
-        <w:t xml:space="preserve">, Saree, Innerwear). Kidswear</w:t>
-      </w:r>
-      <w:r>
-        <w:t xml:space="preserve"> </w:t>
-      </w:r>
-      <w:r>
-        <w:t xml:space="preserve">(</w:t>
+        <w:t xml:space="preserve">, Saree, Innerwear).</w:t>
+      </w:r>
+      <w:r>
+        <w:t xml:space="preserve"> </w:t>
+      </w:r>
+      <w:r>
+        <w:t xml:space="preserve">Kidswear (</w:t>
       </w:r>
       <w:r>
         <w:rPr>
@@ -2058,13 +2283,13 @@
         <w:t xml:space="preserve">kids=True</w:t>
       </w:r>
       <w:r>
-        <w:t xml:space="preserve">) dibuang, gender hanya Men/Women/Unisex. Alasan tiap keputusan</w:t>
-      </w:r>
-      <w:r>
-        <w:t xml:space="preserve"> </w:t>
-      </w:r>
-      <w:r>
-        <w:t xml:space="preserve">tertulis di</w:t>
+        <w:t xml:space="preserve">) dibuang, gender hanya Men/Women/Unisex. Alasan tiap</w:t>
+      </w:r>
+      <w:r>
+        <w:t xml:space="preserve"> </w:t>
+      </w:r>
+      <w:r>
+        <w:t xml:space="preserve">keputusan tertulis di</w:t>
       </w:r>
       <w:r>
         <w:t xml:space="preserve"> </w:t>
@@ -2080,23 +2305,16 @@
       </w:r>
       <w:r>
         <w:t xml:space="preserve">dan dibahas di laporan E4.2.</w:t>
-      </w:r>
-    </w:p>
-    <w:p>
-      <w:r>
-        <w:pict>
-          <v:rect style="width:0;height:1.5pt" o:hralign="center" o:hrstd="t" o:hr="t"/>
-        </w:pict>
       </w:r>
     </w:p>
     <w:bookmarkEnd w:id="23"/>
-    <w:bookmarkStart w:id="24" w:name="Xb5ea5a7c525473d230ec076a1c19e8fffdd2359"/>
+    <w:bookmarkStart w:id="24" w:name="X1ad4799dc9d353f110380e2cf79fe3596b3c8d7"/>
     <w:p>
       <w:pPr>
         <w:pStyle w:val="Heading2"/>
       </w:pPr>
       <w:r>
-        <w:t xml:space="preserve">4. Urutan Menjalankan (Quickstart)</w:t>
+        <w:t xml:space="preserve">4. Urutan Menjalankan (Mulai Cepat)</w:t>
       </w:r>
     </w:p>
     <w:p>
@@ -2685,7 +2903,7 @@
               <w:jc w:val="left"/>
             </w:pPr>
             <w:r>
-              <w:t xml:space="preserve">train seimbang (dup file</w:t>
+              <w:t xml:space="preserve">train seimbang (duplikasi file</w:t>
             </w:r>
             <w:r>
               <w:t xml:space="preserve"> </w:t>
@@ -2697,7 +2915,7 @@
               <w:t xml:space="preserve">_dupN</w:t>
             </w:r>
             <w:r>
-              <w:t xml:space="preserve">), laporan proporsi</w:t>
+              <w:t xml:space="preserve">) + laporan proporsi</w:t>
             </w:r>
           </w:p>
         </w:tc>
@@ -2832,7 +3050,7 @@
               <w:t xml:space="preserve"> </w:t>
             </w:r>
             <w:r>
-              <w:t xml:space="preserve">(report txt, confusion matrix png, per-sumber csv)</w:t>
+              <w:t xml:space="preserve">(laporan txt, confusion matrix png, per-sumber csv)</w:t>
             </w:r>
           </w:p>
         </w:tc>
@@ -2879,13 +3097,6 @@
         </w:tc>
       </w:tr>
     </w:tbl>
-    <w:p>
-      <w:r>
-        <w:pict>
-          <v:rect style="width:0;height:1.5pt" o:hralign="center" o:hrstd="t" o:hr="t"/>
-        </w:pict>
-      </w:r>
-    </w:p>
     <w:bookmarkEnd w:id="24"/>
     <w:bookmarkStart w:id="25" w:name="X7d70a394956f6508f1e120ad1781268a93b744c"/>
     <w:p>
@@ -2980,13 +3191,13 @@
         <w:t xml:space="preserve"> </w:t>
       </w:r>
       <w:r>
-        <w:t xml:space="preserve">Test set utama = Clothing Dataset Full (dipakai angka laporan); test per-sumber</w:t>
-      </w:r>
-      <w:r>
-        <w:t xml:space="preserve"> </w:t>
-      </w:r>
-      <w:r>
-        <w:t xml:space="preserve">lain tersimpan via kolom</w:t>
+        <w:t xml:space="preserve">Data uji utama = Clothing Dataset Full (dipakai untuk angka laporan); data uji</w:t>
+      </w:r>
+      <w:r>
+        <w:t xml:space="preserve"> </w:t>
+      </w:r>
+      <w:r>
+        <w:t xml:space="preserve">per-sumber lain tersimpan lewat kolom</w:t>
       </w:r>
       <w:r>
         <w:t xml:space="preserve"> </w:t>
@@ -3001,7 +3212,7 @@
         <w:t xml:space="preserve"> </w:t>
       </w:r>
       <w:r>
-        <w:t xml:space="preserve">untuk uji robustness.</w:t>
+        <w:t xml:space="preserve">untuk uji ketahanan.</w:t>
       </w:r>
     </w:p>
     <w:p>
@@ -3019,7 +3230,7 @@
         <w:t xml:space="preserve"> </w:t>
       </w:r>
       <w:r>
-        <w:t xml:space="preserve">Oversampling kelas minoritas hanya di</w:t>
+        <w:t xml:space="preserve">Penambahan sampel (oversampling) kelas minoritas hanya di</w:t>
       </w:r>
       <w:r>
         <w:t xml:space="preserve"> </w:t>
@@ -3035,13 +3246,7 @@
         <w:t xml:space="preserve"> </w:t>
       </w:r>
       <w:r>
-        <w:t xml:space="preserve">(duplikasi</w:t>
-      </w:r>
-      <w:r>
-        <w:t xml:space="preserve"> </w:t>
-      </w:r>
-      <w:r>
-        <w:t xml:space="preserve">file, suffix</w:t>
+        <w:t xml:space="preserve">(duplikasi file, suffix</w:t>
       </w:r>
       <w:r>
         <w:t xml:space="preserve"> </w:t>
@@ -3068,7 +3273,13 @@
         <w:t xml:space="preserve"> </w:t>
       </w:r>
       <w:r>
-        <w:t xml:space="preserve">memindahkan kelebihan sumber dominan ke folder</w:t>
+        <w:t xml:space="preserve">memindahkan kelebihan sumber dominan ke</w:t>
+      </w:r>
+      <w:r>
+        <w:t xml:space="preserve"> </w:t>
+      </w:r>
+      <w:r>
+        <w:t xml:space="preserve">folder</w:t>
       </w:r>
       <w:r>
         <w:t xml:space="preserve"> </w:t>
@@ -3101,19 +3312,19 @@
         <w:t xml:space="preserve"> </w:t>
       </w:r>
       <w:r>
-        <w:t xml:space="preserve">MobileNetV2 (ImageNet) transfer learning 2 fase: freeze</w:t>
-      </w:r>
-      <w:r>
-        <w:t xml:space="preserve"> </w:t>
-      </w:r>
-      <w:r>
-        <w:t xml:space="preserve">backbone → unfreeze blok akhir. Angka ini jadi pembanding klaim "YOLOv11n lebih</w:t>
-      </w:r>
-      <w:r>
-        <w:t xml:space="preserve"> </w:t>
-      </w:r>
-      <w:r>
-        <w:t xml:space="preserve">baik" di laporan.</w:t>
+        <w:t xml:space="preserve">MobileNetV2 (ImageNet) transfer learning 2 fase: bekukan</w:t>
+      </w:r>
+      <w:r>
+        <w:t xml:space="preserve"> </w:t>
+      </w:r>
+      <w:r>
+        <w:t xml:space="preserve">backbone → latih ulang blok akhir. Angka ini menjadi pembanding klaim</w:t>
+      </w:r>
+      <w:r>
+        <w:t xml:space="preserve"> </w:t>
+      </w:r>
+      <w:r>
+        <w:t xml:space="preserve">"YOLOv11n lebih baik" di laporan.</w:t>
       </w:r>
     </w:p>
     <w:p>
@@ -3164,7 +3375,7 @@
         <w:t xml:space="preserve"> </w:t>
       </w:r>
       <w:r>
-        <w:t xml:space="preserve">kelas otomatis dipakai; kalau tidak, andalkan hasil</w:t>
+        <w:t xml:space="preserve">kelas otomatis dipakai; kalau tidak, andalkan hasil script</w:t>
       </w:r>
       <w:r>
         <w:t xml:space="preserve"> </w:t>
@@ -3205,13 +3416,13 @@
         <w:t xml:space="preserve"> </w:t>
       </w:r>
       <w:r>
-        <w:t xml:space="preserve">agar konsisten dengan proposal. Default transform</w:t>
-      </w:r>
-      <w:r>
-        <w:t xml:space="preserve"> </w:t>
-      </w:r>
-      <w:r>
-        <w:t xml:space="preserve">training =</w:t>
+        <w:t xml:space="preserve">agar konsisten dengan proposal. Transformasi bawaan</w:t>
+      </w:r>
+      <w:r>
+        <w:t xml:space="preserve"> </w:t>
+      </w:r>
+      <w:r>
+        <w:t xml:space="preserve">pelatihan =</w:t>
       </w:r>
       <w:r>
         <w:t xml:space="preserve"> </w:t>
@@ -3226,7 +3437,7 @@
         <w:t xml:space="preserve"> </w:t>
       </w:r>
       <w:r>
-        <w:t xml:space="preserve">(bisa memotong pinggiran) — lihat docs</w:t>
+        <w:t xml:space="preserve">(bisa memotong pinggiran) — lihat dokumentasi</w:t>
       </w:r>
       <w:r>
         <w:t xml:space="preserve"> </w:t>
@@ -3250,7 +3461,13 @@
         <w:t xml:space="preserve"> </w:t>
       </w:r>
       <w:r>
-        <w:t xml:space="preserve">Angka wajib: top-1, macro F1, confusion matrix,</w:t>
+        <w:t xml:space="preserve">Angka wajib: top-1, macro F1, confusion matrix (matriks</w:t>
+      </w:r>
+      <w:r>
+        <w:t xml:space="preserve"> </w:t>
+      </w:r>
+      <w:r>
+        <w:t xml:space="preserve">kesalahan), akurasi</w:t>
       </w:r>
       <w:r>
         <w:t xml:space="preserve"> </w:t>
@@ -3260,13 +3477,34 @@
           <w:bCs/>
           <w:b/>
         </w:rPr>
-        <w:t xml:space="preserve">akurasi</w:t>
+        <w:t xml:space="preserve">per sumber</w:t>
+      </w:r>
+      <w:r>
+        <w:t xml:space="preserve">, + 150 foto lapangan (E10.2, uji ketahanan).</w:t>
+      </w:r>
+      <w:r>
+        <w:t xml:space="preserve"> </w:t>
+      </w:r>
+      <w:r>
+        <w:t xml:space="preserve">Target: akurasi</w:t>
+      </w:r>
+      <w:r>
+        <w:t xml:space="preserve"> </w:t>
       </w:r>
       <w:r>
         <w:rPr>
           <w:bCs/>
           <w:b/>
         </w:rPr>
+        <w:t xml:space="preserve">≥ 80%</w:t>
+      </w:r>
+      <w:r>
+        <w:t xml:space="preserve"> </w:t>
+      </w:r>
+      <w:r>
+        <w:t xml:space="preserve">dan F1</w:t>
+      </w:r>
+      <w:r>
         <w:t xml:space="preserve"> </w:t>
       </w:r>
       <w:r>
@@ -3274,16 +3512,13 @@
           <w:bCs/>
           <w:b/>
         </w:rPr>
-        <w:t xml:space="preserve">per sumber</w:t>
-      </w:r>
-      <w:r>
-        <w:t xml:space="preserve">, + 150 foto lapangan (E10.2, uji robustness). Target: akurasi</w:t>
-      </w:r>
-      <w:r>
-        <w:t xml:space="preserve"> </w:t>
-      </w:r>
-      <w:r>
-        <w:t xml:space="preserve">≥ 80% dan F1 ≥ 0,75 di test (target antara 75%).</w:t>
+        <w:t xml:space="preserve">≥ 0,75</w:t>
+      </w:r>
+      <w:r>
+        <w:t xml:space="preserve"> </w:t>
+      </w:r>
+      <w:r>
+        <w:t xml:space="preserve">di data uji (target antara 75%).</w:t>
       </w:r>
     </w:p>
     <w:p>
@@ -3338,36 +3573,13 @@
         <w:t xml:space="preserve"> </w:t>
       </w:r>
       <w:r>
-        <w:t xml:space="preserve">(≤ ~6 MB biasanya). Serahkan ke E7.1 bersama</w:t>
-      </w:r>
-      <w:r>
-        <w:t xml:space="preserve"> </w:t>
-      </w:r>
-      <w:r>
-        <w:rPr>
-          <w:iCs/>
-          <w:i/>
-        </w:rPr>
-        <w:t xml:space="preserve">model card</w:t>
-      </w:r>
-      <w:r>
-        <w:t xml:space="preserve"> </w:t>
-      </w:r>
-      <w:r>
-        <w:t xml:space="preserve">(input 224×224,</w:t>
-      </w:r>
-      <w:r>
-        <w:t xml:space="preserve"> </w:t>
-      </w:r>
-      <w:r>
-        <w:t xml:space="preserve">output urutan 9 kelas, metrik).</w:t>
-      </w:r>
-    </w:p>
-    <w:p>
-      <w:r>
-        <w:pict>
-          <v:rect style="width:0;height:1.5pt" o:hralign="center" o:hrstd="t" o:hr="t"/>
-        </w:pict>
+        <w:t xml:space="preserve">(biasanya ≤ ~6 MB). Serahkan ke E7.1 bersama kartu model (model card): input</w:t>
+      </w:r>
+      <w:r>
+        <w:t xml:space="preserve"> </w:t>
+      </w:r>
+      <w:r>
+        <w:t xml:space="preserve">224×224, urutan 9 kelas pada output, dan metrik.</w:t>
       </w:r>
     </w:p>
     <w:bookmarkEnd w:id="25"/>
@@ -3500,18 +3712,18 @@
               <w:jc w:val="left"/>
             </w:pPr>
             <w:r>
-              <w:t xml:space="preserve">Tuning di test set</w:t>
-            </w:r>
-          </w:p>
-        </w:tc>
-        <w:tc>
-          <w:p>
-            <w:pPr>
-              <w:pStyle w:val="Compact"/>
-              <w:jc w:val="left"/>
-            </w:pPr>
-            <w:r>
-              <w:t xml:space="preserve">Test beku; tuning di val</w:t>
+              <w:t xml:space="preserve">Tuning di data uji</w:t>
+            </w:r>
+          </w:p>
+        </w:tc>
+        <w:tc>
+          <w:p>
+            <w:pPr>
+              <w:pStyle w:val="Compact"/>
+              <w:jc w:val="left"/>
+            </w:pPr>
+            <w:r>
+              <w:t xml:space="preserve">Data uji dibekukan; tuning di val</w:t>
             </w:r>
           </w:p>
         </w:tc>
@@ -3574,15 +3786,8 @@
         </w:tc>
       </w:tr>
     </w:tbl>
-    <w:p>
-      <w:r>
-        <w:pict>
-          <v:rect style="width:0;height:1.5pt" o:hralign="center" o:hrstd="t" o:hr="t"/>
-        </w:pict>
-      </w:r>
-    </w:p>
     <w:bookmarkEnd w:id="26"/>
-    <w:bookmarkStart w:id="34" w:name="X436d74ec7ff04e86a7429f384913d710b477f22"/>
+    <w:bookmarkStart w:id="31" w:name="X436d74ec7ff04e86a7429f384913d710b477f22"/>
     <w:p>
       <w:pPr>
         <w:pStyle w:val="Heading2"/>
@@ -3600,7 +3805,7 @@
         <w:pStyle w:val="Compact"/>
       </w:pPr>
       <w:r>
-        <w:t xml:space="preserve">Format dataset &amp; training classify (Ultralytics):</w:t>
+        <w:t xml:space="preserve">Format dataset &amp; pelatihan classify (Ultralytics):</w:t>
       </w:r>
       <w:r>
         <w:t xml:space="preserve"> </w:t>
@@ -3686,53 +3891,14 @@
         <w:pStyle w:val="Compact"/>
       </w:pPr>
       <w:r>
-        <w:t xml:space="preserve">Dataset:</w:t>
-      </w:r>
-      <w:r>
-        <w:t xml:space="preserve"> </w:t>
-      </w:r>
-      <w:hyperlink r:id="rId31">
-        <w:r>
-          <w:rPr>
-            <w:rStyle w:val="Hyperlink"/>
-          </w:rPr>
-          <w:t xml:space="preserve">Clothing Full (CC0)</w:t>
-        </w:r>
-      </w:hyperlink>
-      <w:r>
-        <w:t xml:space="preserve"> </w:t>
-      </w:r>
-      <w:r>
-        <w:t xml:space="preserve">·</w:t>
-      </w:r>
-      <w:r>
-        <w:t xml:space="preserve"> </w:t>
-      </w:r>
-      <w:hyperlink r:id="rId32">
-        <w:r>
-          <w:rPr>
-            <w:rStyle w:val="Hyperlink"/>
-          </w:rPr>
-          <w:t xml:space="preserve">Fashion Product Images (MIT)</w:t>
-        </w:r>
-      </w:hyperlink>
-      <w:r>
-        <w:t xml:space="preserve"> </w:t>
-      </w:r>
-      <w:r>
-        <w:t xml:space="preserve">·</w:t>
-      </w:r>
-      <w:r>
-        <w:t xml:space="preserve"> </w:t>
-      </w:r>
-      <w:hyperlink r:id="rId33">
-        <w:r>
-          <w:rPr>
-            <w:rStyle w:val="Hyperlink"/>
-          </w:rPr>
-          <w:t xml:space="preserve">Carousell (MIT)</w:t>
-        </w:r>
-      </w:hyperlink>
+        <w:t xml:space="preserve">Dataset (semua lisensi bebas): Clothing Full (CC0) · Fashion Product Images</w:t>
+      </w:r>
+      <w:r>
+        <w:t xml:space="preserve"> </w:t>
+      </w:r>
+      <w:r>
+        <w:t xml:space="preserve">(MIT) · Carousell (MIT)</w:t>
+      </w:r>
     </w:p>
     <w:p>
       <w:pPr>
@@ -3767,7 +3933,10 @@
         <w:t xml:space="preserve">context/datasets-tambahan.md</w:t>
       </w:r>
       <w:r>
-        <w:t xml:space="preserve">,</w:t>
+        <w:t xml:space="preserve"> </w:t>
+      </w:r>
+      <w:r>
+        <w:t xml:space="preserve">(§1 &amp; §5),</w:t>
       </w:r>
       <w:r>
         <w:t xml:space="preserve"> </w:t>
@@ -3776,11 +3945,11 @@
         <w:rPr>
           <w:rStyle w:val="VerbatimChar"/>
         </w:rPr>
-        <w:t xml:space="preserve">context/implementasi-plan.md</w:t>
+        <w:t xml:space="preserve">context/implementation-plan.md</w:t>
       </w:r>
     </w:p>
-    <w:bookmarkEnd w:id="34"/>
-    <w:bookmarkEnd w:id="35"/>
+    <w:bookmarkEnd w:id="31"/>
+    <w:bookmarkEnd w:id="32"/>
     <w:sectPr/>
   </w:body>
 </w:document>

</xml_diff>